<commit_message>
Update Requerimientos funcionales y no funcionales V1.0.1.docx
</commit_message>
<xml_diff>
--- a/PropuestaProyecto/Requerimientos funcionales y no funcionales V1.0.1.docx
+++ b/PropuestaProyecto/Requerimientos funcionales y no funcionales V1.0.1.docx
@@ -48,33 +48,7 @@
           <w:bCs/>
           <w:lang w:val="es-MX"/>
         </w:rPr>
-        <w:t xml:space="preserve">1. </w:t>
-      </w:r>
-      <w:r>
-        <w:rPr>
-          <w:b/>
-          <w:bCs/>
-          <w:lang w:val="es-MX"/>
-        </w:rPr>
-        <w:t xml:space="preserve">Registro y </w:t>
-      </w:r>
-      <w:proofErr w:type="spellStart"/>
-      <w:r>
-        <w:rPr>
-          <w:b/>
-          <w:bCs/>
-          <w:lang w:val="es-MX"/>
-        </w:rPr>
-        <w:t>login</w:t>
-      </w:r>
-      <w:proofErr w:type="spellEnd"/>
-      <w:r>
-        <w:rPr>
-          <w:b/>
-          <w:bCs/>
-          <w:lang w:val="es-MX"/>
-        </w:rPr>
-        <w:t xml:space="preserve"> de usuarios</w:t>
+        <w:t>1. Registro y login de usuarios</w:t>
       </w:r>
     </w:p>
     <w:p>
@@ -128,7 +102,43 @@
         <w:rPr>
           <w:lang w:val="es-MX"/>
         </w:rPr>
-        <w:t>Validación de datos (correo no repetido, contraseña segura).</w:t>
+        <w:t>Validación de datos (</w:t>
+      </w:r>
+      <w:r>
+        <w:rPr>
+          <w:lang w:val="es-MX"/>
+        </w:rPr>
+        <w:t>q</w:t>
+      </w:r>
+      <w:r>
+        <w:rPr>
+          <w:lang w:val="es-MX"/>
+        </w:rPr>
+        <w:t>ue el correo no esté registrado previamente</w:t>
+      </w:r>
+      <w:r>
+        <w:rPr>
+          <w:lang w:val="es-MX"/>
+        </w:rPr>
+        <w:t xml:space="preserve">, </w:t>
+      </w:r>
+      <w:r>
+        <w:rPr>
+          <w:lang w:val="es-MX"/>
+        </w:rPr>
+        <w:t>q</w:t>
+      </w:r>
+      <w:r>
+        <w:rPr>
+          <w:lang w:val="es-MX"/>
+        </w:rPr>
+        <w:t>ue la contraseña cumpla con criterios mínimos de seguridad</w:t>
+      </w:r>
+      <w:r>
+        <w:rPr>
+          <w:lang w:val="es-MX"/>
+        </w:rPr>
+        <w:t>).</w:t>
       </w:r>
     </w:p>
     <w:p>
@@ -139,31 +149,13 @@
         </w:rPr>
         <w:t xml:space="preserve">2. </w:t>
       </w:r>
-      <w:proofErr w:type="spellStart"/>
       <w:r>
         <w:rPr>
           <w:b/>
           <w:bCs/>
         </w:rPr>
-        <w:t>Reservación</w:t>
-      </w:r>
-      <w:proofErr w:type="spellEnd"/>
-      <w:r>
-        <w:rPr>
-          <w:b/>
-          <w:bCs/>
-        </w:rPr>
-        <w:t xml:space="preserve"> de </w:t>
-      </w:r>
-      <w:proofErr w:type="spellStart"/>
-      <w:r>
-        <w:rPr>
-          <w:b/>
-          <w:bCs/>
-        </w:rPr>
-        <w:t>citas</w:t>
-      </w:r>
-      <w:proofErr w:type="spellEnd"/>
+        <w:t>Reservación de citas</w:t>
+      </w:r>
     </w:p>
     <w:p>
       <w:pPr>
@@ -286,47 +278,13 @@
         </w:rPr>
         <w:t xml:space="preserve">4. </w:t>
       </w:r>
-      <w:proofErr w:type="spellStart"/>
       <w:r>
         <w:rPr>
           <w:b/>
           <w:bCs/>
         </w:rPr>
-        <w:t>Notificaciones</w:t>
-      </w:r>
-      <w:proofErr w:type="spellEnd"/>
-      <w:r>
-        <w:rPr>
-          <w:b/>
-          <w:bCs/>
-        </w:rPr>
-        <w:t xml:space="preserve"> y </w:t>
-      </w:r>
-      <w:proofErr w:type="spellStart"/>
-      <w:r>
-        <w:rPr>
-          <w:b/>
-          <w:bCs/>
-        </w:rPr>
-        <w:t>recordatorios</w:t>
-      </w:r>
-      <w:proofErr w:type="spellEnd"/>
-      <w:r>
-        <w:rPr>
-          <w:b/>
-          <w:bCs/>
-        </w:rPr>
-        <w:t xml:space="preserve"> </w:t>
-      </w:r>
-      <w:proofErr w:type="spellStart"/>
-      <w:r>
-        <w:rPr>
-          <w:b/>
-          <w:bCs/>
-        </w:rPr>
-        <w:t>automáticos</w:t>
-      </w:r>
-      <w:proofErr w:type="spellEnd"/>
+        <w:t>Notificaciones y recordatorios automáticos</w:t>
+      </w:r>
     </w:p>
     <w:p>
       <w:pPr>
@@ -390,37 +348,12 @@
         </w:rPr>
         <w:t xml:space="preserve">5. </w:t>
       </w:r>
-      <w:proofErr w:type="spellStart"/>
       <w:r>
         <w:rPr>
           <w:b/>
           <w:bCs/>
         </w:rPr>
-        <w:t>Editar</w:t>
-      </w:r>
-      <w:proofErr w:type="spellEnd"/>
-      <w:r>
-        <w:rPr>
-          <w:b/>
-          <w:bCs/>
-        </w:rPr>
-        <w:t xml:space="preserve"> </w:t>
-      </w:r>
-      <w:proofErr w:type="spellStart"/>
-      <w:r>
-        <w:rPr>
-          <w:b/>
-          <w:bCs/>
-        </w:rPr>
-        <w:t>información</w:t>
-      </w:r>
-      <w:proofErr w:type="spellEnd"/>
-      <w:r>
-        <w:rPr>
-          <w:b/>
-          <w:bCs/>
-        </w:rPr>
-        <w:t xml:space="preserve"> personal</w:t>
+        <w:t>Editar información personal</w:t>
       </w:r>
     </w:p>
     <w:p>
@@ -501,7 +434,6 @@
           <w:bCs/>
           <w:lang w:val="es-MX"/>
         </w:rPr>
-        <w:lastRenderedPageBreak/>
         <w:t>Parte del Administrador (Negocio/Consultorio)</w:t>
       </w:r>
     </w:p>
@@ -517,33 +449,7 @@
           <w:bCs/>
           <w:lang w:val="es-MX"/>
         </w:rPr>
-        <w:t xml:space="preserve">1. </w:t>
-      </w:r>
-      <w:r>
-        <w:rPr>
-          <w:b/>
-          <w:bCs/>
-          <w:lang w:val="es-MX"/>
-        </w:rPr>
-        <w:t xml:space="preserve">Registro y </w:t>
-      </w:r>
-      <w:proofErr w:type="spellStart"/>
-      <w:r>
-        <w:rPr>
-          <w:b/>
-          <w:bCs/>
-          <w:lang w:val="es-MX"/>
-        </w:rPr>
-        <w:t>login</w:t>
-      </w:r>
-      <w:proofErr w:type="spellEnd"/>
-      <w:r>
-        <w:rPr>
-          <w:b/>
-          <w:bCs/>
-          <w:lang w:val="es-MX"/>
-        </w:rPr>
-        <w:t xml:space="preserve"> del negocio</w:t>
+        <w:t>1. Registro y login del negocio</w:t>
       </w:r>
     </w:p>
     <w:p>
@@ -713,17 +619,8 @@
           <w:b/>
           <w:bCs/>
         </w:rPr>
-        <w:t xml:space="preserve">Panel </w:t>
-      </w:r>
-      <w:proofErr w:type="spellStart"/>
-      <w:r>
-        <w:rPr>
-          <w:b/>
-          <w:bCs/>
-        </w:rPr>
-        <w:t>administrativo</w:t>
-      </w:r>
-      <w:proofErr w:type="spellEnd"/>
+        <w:t>Panel administrativo</w:t>
+      </w:r>
     </w:p>
     <w:p>
       <w:pPr>
@@ -805,47 +702,13 @@
         </w:rPr>
         <w:t xml:space="preserve">5. </w:t>
       </w:r>
-      <w:proofErr w:type="spellStart"/>
       <w:r>
         <w:rPr>
           <w:b/>
           <w:bCs/>
         </w:rPr>
-        <w:t>Notificaciones</w:t>
-      </w:r>
-      <w:proofErr w:type="spellEnd"/>
-      <w:r>
-        <w:rPr>
-          <w:b/>
-          <w:bCs/>
-        </w:rPr>
-        <w:t xml:space="preserve"> y </w:t>
-      </w:r>
-      <w:proofErr w:type="spellStart"/>
-      <w:r>
-        <w:rPr>
-          <w:b/>
-          <w:bCs/>
-        </w:rPr>
-        <w:t>recordatorios</w:t>
-      </w:r>
-      <w:proofErr w:type="spellEnd"/>
-      <w:r>
-        <w:rPr>
-          <w:b/>
-          <w:bCs/>
-        </w:rPr>
-        <w:t xml:space="preserve"> </w:t>
-      </w:r>
-      <w:proofErr w:type="spellStart"/>
-      <w:r>
-        <w:rPr>
-          <w:b/>
-          <w:bCs/>
-        </w:rPr>
-        <w:t>automáticos</w:t>
-      </w:r>
-      <w:proofErr w:type="spellEnd"/>
+        <w:t>Notificaciones y recordatorios automáticos</w:t>
+      </w:r>
     </w:p>
     <w:p>
       <w:pPr>
@@ -972,6 +835,7 @@
         <w:rPr>
           <w:lang w:val="es-MX"/>
         </w:rPr>
+        <w:lastRenderedPageBreak/>
         <w:t>Posibilidad de modificar datos de los clientes si es necesario (teléfono, correo, datos de contacto).</w:t>
       </w:r>
     </w:p>
@@ -989,7 +853,6 @@
           <w:bCs/>
           <w:lang w:val="es-MX"/>
         </w:rPr>
-        <w:lastRenderedPageBreak/>
         <w:t>Requerimientos no funcionales</w:t>
       </w:r>
     </w:p>
@@ -1073,33 +936,8 @@
           <w:b/>
           <w:bCs/>
         </w:rPr>
-        <w:t xml:space="preserve">2. </w:t>
-      </w:r>
-      <w:proofErr w:type="spellStart"/>
-      <w:r>
-        <w:rPr>
-          <w:b/>
-          <w:bCs/>
-        </w:rPr>
-        <w:t>Rendimiento</w:t>
-      </w:r>
-      <w:proofErr w:type="spellEnd"/>
-      <w:r>
-        <w:rPr>
-          <w:b/>
-          <w:bCs/>
-        </w:rPr>
-        <w:t xml:space="preserve"> / </w:t>
-      </w:r>
-      <w:proofErr w:type="spellStart"/>
-      <w:r>
-        <w:rPr>
-          <w:b/>
-          <w:bCs/>
-        </w:rPr>
-        <w:t>Velocidad</w:t>
-      </w:r>
-      <w:proofErr w:type="spellEnd"/>
+        <w:t>2. Rendimiento / Velocidad</w:t>
+      </w:r>
     </w:p>
     <w:p>
       <w:pPr>
@@ -1171,17 +1009,8 @@
           <w:b/>
           <w:bCs/>
         </w:rPr>
-        <w:t xml:space="preserve">3. </w:t>
-      </w:r>
-      <w:proofErr w:type="spellStart"/>
-      <w:r>
-        <w:rPr>
-          <w:b/>
-          <w:bCs/>
-        </w:rPr>
-        <w:t>Seguridad</w:t>
-      </w:r>
-      <w:proofErr w:type="spellEnd"/>
+        <w:t>3. Seguridad</w:t>
+      </w:r>
     </w:p>
     <w:p>
       <w:pPr>
@@ -1214,21 +1043,7 @@
         <w:rPr>
           <w:lang w:val="es-MX"/>
         </w:rPr>
-        <w:t xml:space="preserve">Autenticación segura en el registro y </w:t>
-      </w:r>
-      <w:proofErr w:type="spellStart"/>
-      <w:r>
-        <w:rPr>
-          <w:lang w:val="es-MX"/>
-        </w:rPr>
-        <w:t>login</w:t>
-      </w:r>
-      <w:proofErr w:type="spellEnd"/>
-      <w:r>
-        <w:rPr>
-          <w:lang w:val="es-MX"/>
-        </w:rPr>
-        <w:t>, evitando accesos no autorizados.</w:t>
+        <w:t>Autenticación segura en el registro y login, evitando accesos no autorizados.</w:t>
       </w:r>
     </w:p>
     <w:p>
@@ -1292,23 +1107,7 @@
           <w:b/>
           <w:bCs/>
         </w:rPr>
-        <w:t xml:space="preserve">5. </w:t>
-      </w:r>
-      <w:proofErr w:type="spellStart"/>
-      <w:r>
-        <w:rPr>
-          <w:b/>
-          <w:bCs/>
-        </w:rPr>
-        <w:t>Compatibilidad</w:t>
-      </w:r>
-      <w:proofErr w:type="spellEnd"/>
-      <w:r>
-        <w:rPr>
-          <w:b/>
-          <w:bCs/>
-        </w:rPr>
-        <w:t xml:space="preserve"> / Responsive</w:t>
+        <w:t>5. Compatibilidad / Responsive</w:t>
       </w:r>
     </w:p>
     <w:p>
@@ -1366,11 +1165,10 @@
           <w:numId w:val="16"/>
         </w:numPr>
       </w:pPr>
-      <w:proofErr w:type="spellStart"/>
-      <w:r>
+      <w:r>
+        <w:lastRenderedPageBreak/>
         <w:t>Celulares</w:t>
       </w:r>
-      <w:proofErr w:type="spellEnd"/>
       <w:r>
         <w:t xml:space="preserve"> (Android e iOS)</w:t>
       </w:r>
@@ -1401,21 +1199,7 @@
         <w:rPr>
           <w:lang w:val="es-MX"/>
         </w:rPr>
-        <w:t xml:space="preserve"> (responsive </w:t>
-      </w:r>
-      <w:proofErr w:type="spellStart"/>
-      <w:r>
-        <w:rPr>
-          <w:lang w:val="es-MX"/>
-        </w:rPr>
-        <w:t>design</w:t>
-      </w:r>
-      <w:proofErr w:type="spellEnd"/>
-      <w:r>
-        <w:rPr>
-          <w:lang w:val="es-MX"/>
-        </w:rPr>
-        <w:t>).</w:t>
+        <w:t xml:space="preserve"> (responsive design).</w:t>
       </w:r>
     </w:p>
     <w:p>
@@ -1430,18 +1214,8 @@
           <w:b/>
           <w:bCs/>
         </w:rPr>
-        <w:lastRenderedPageBreak/>
-        <w:t xml:space="preserve">6. </w:t>
-      </w:r>
-      <w:proofErr w:type="spellStart"/>
-      <w:r>
-        <w:rPr>
-          <w:b/>
-          <w:bCs/>
-        </w:rPr>
-        <w:t>Mantenibilidad</w:t>
-      </w:r>
-      <w:proofErr w:type="spellEnd"/>
+        <w:t>6. Mantenibilidad</w:t>
+      </w:r>
     </w:p>
     <w:p>
       <w:pPr>
@@ -1501,17 +1275,8 @@
           <w:b/>
           <w:bCs/>
         </w:rPr>
-        <w:t xml:space="preserve">7. </w:t>
-      </w:r>
-      <w:proofErr w:type="spellStart"/>
-      <w:r>
-        <w:rPr>
-          <w:b/>
-          <w:bCs/>
-        </w:rPr>
-        <w:t>Escalabilidad</w:t>
-      </w:r>
-      <w:proofErr w:type="spellEnd"/>
+        <w:t>7. Escalabilidad</w:t>
+      </w:r>
     </w:p>
     <w:p>
       <w:pPr>
@@ -4025,7 +3790,7 @@
   <w:abstractNum w:abstractNumId="19" w15:restartNumberingAfterBreak="0">
     <w:nsid w:val="47CC2EB9"/>
     <w:multiLevelType w:val="hybridMultilevel"/>
-    <w:tmpl w:val="6FAA3888"/>
+    <w:tmpl w:val="2062954A"/>
     <w:lvl w:ilvl="0" w:tplc="04090001">
       <w:start w:val="1"/>
       <w:numFmt w:val="bullet"/>
@@ -6730,6 +6495,7 @@
   <w:style w:type="character" w:default="1" w:styleId="Fuentedeprrafopredeter">
     <w:name w:val="Default Paragraph Font"/>
     <w:uiPriority w:val="1"/>
+    <w:semiHidden/>
     <w:unhideWhenUsed/>
   </w:style>
   <w:style w:type="table" w:default="1" w:styleId="Tablanormal">

</xml_diff>